<commit_message>
Ep.1 ladder: add the BrewMaps flag and the ladder kick
The flag rides rolled up on the ladder, snaps open on the last click,
and he plants it on the glass rim before hopping in; afterwards he
pushes the ladder over with his foot and the flag stays on his drink.
Sound cues are now read from the animation (events.js), which draws
on twos, so the mix follows any timing change. Previous cut kept as
reel-ladder-v2.js.

Co-Authored-By: Claude Opus 5.5 <noreply@anthropic.com>
Claude-Session: https://claude.ai/code/session_01UCKVHF8Bj15Neb29ir5cAN
</commit_message>
<xml_diff>
--- a/marketing/posts/found-my-coffee/export/ep1-ladder-script.docx
+++ b/marketing/posts/found-my-coffee/export/ep1-ladder-script.docx
@@ -39,7 +39,7 @@
           <w:sz w:val="34"/>
           <w:szCs w:val="34"/>
         </w:rPr>
-        <w:t xml:space="preserve"> · Ep. 1 “The Ladder”</w:t>
+        <w:t xml:space="preserve"> · Ep. 1 “The Ladder” (with the flag)</w:t>
       </w:r>
     </w:p>
     <w:p>
@@ -73,7 +73,7 @@
           <w:szCs w:val="20"/>
           <w:rtl w:val="false"/>
         </w:rPr>
-        <w:t xml:space="preserve">16.6s · 9:16 vertical · silent master (sound added in Instagram). Same café, two drinks on a dark wooden counter: a hot cappuccino (right) and an iced latte in a short glass (left). A slow push-in runs through the whole piece.</w:t>
+        <w:t xml:space="preserve">18.5s · 9:16 vertical · with music and sound effects. Same café, two drinks on a dark wooden counter: a hot cappuccino (right) and an iced latte in a short glass (left). A slow push-in runs through the whole piece.</w:t>
       </w:r>
     </w:p>
     <w:tbl>
@@ -1436,7 +1436,7 @@
                 <w:szCs w:val="20"/>
                 <w:rtl w:val="false"/>
               </w:rPr>
-              <w:t xml:space="preserve">Pulls a folded ladder straight out of the pouch.</w:t>
+              <w:t xml:space="preserve">Pulls a folded ladder straight out of the pouch; a rolled-up green flag is tied to its top.</w:t>
             </w:r>
           </w:p>
         </w:tc>
@@ -1613,7 +1613,7 @@
                 <w:szCs w:val="20"/>
                 <w:rtl w:val="false"/>
               </w:rPr>
-              <w:t xml:space="preserve">The ladder extends up to the rim in three steps; he watches it rise.</w:t>
+              <w:t xml:space="preserve">The ladder extends up to the rim in three clicks; on the last one the flag snaps open: the BrewMaps flag.</w:t>
             </w:r>
           </w:p>
         </w:tc>
@@ -1642,7 +1642,7 @@
                 <w:szCs w:val="20"/>
                 <w:rtl w:val="false"/>
               </w:rPr>
-              <w:t xml:space="preserve">—</w:t>
+              <w:t xml:space="preserve">BrewMaps flag</w:t>
             </w:r>
           </w:p>
         </w:tc>
@@ -1702,7 +1702,7 @@
                 <w:szCs w:val="20"/>
                 <w:rtl w:val="false"/>
               </w:rPr>
-              <w:t xml:space="preserve">Climbs it rung by rung.</w:t>
+              <w:t xml:space="preserve">Climbs it rung by rung, the flag flying over the glass.</w:t>
             </w:r>
           </w:p>
         </w:tc>
@@ -1763,7 +1763,7 @@
                 <w:szCs w:val="20"/>
                 <w:rtl w:val="false"/>
               </w:rPr>
-              <w:t xml:space="preserve">9.6–9.95</w:t>
+              <w:t xml:space="preserve">9.6–9.75</w:t>
             </w:r>
           </w:p>
         </w:tc>
@@ -1790,7 +1790,7 @@
                 <w:szCs w:val="20"/>
                 <w:rtl w:val="false"/>
               </w:rPr>
-              <w:t xml:space="preserve">At the top, a little hop over the rim, into the glass.</w:t>
+              <w:t xml:space="preserve">At the top he takes the flag off the ladder.</w:t>
             </w:r>
           </w:p>
         </w:tc>
@@ -1851,7 +1851,7 @@
                 <w:szCs w:val="20"/>
                 <w:rtl w:val="false"/>
               </w:rPr>
-              <w:t xml:space="preserve">9.95–10.2</w:t>
+              <w:t xml:space="preserve">9.75–9.9</w:t>
             </w:r>
           </w:p>
         </w:tc>
@@ -1879,7 +1879,7 @@
                 <w:szCs w:val="20"/>
                 <w:rtl w:val="false"/>
               </w:rPr>
-              <w:t xml:space="preserve">Splash: drops fly up, ripples across the ice. He is under.</w:t>
+              <w:t xml:space="preserve">Raises it over his head like a summit flag.</w:t>
             </w:r>
           </w:p>
         </w:tc>
@@ -1940,7 +1940,7 @@
                 <w:szCs w:val="20"/>
                 <w:rtl w:val="false"/>
               </w:rPr>
-              <w:t xml:space="preserve">10.2–10.55</w:t>
+              <w:t xml:space="preserve">9.9–10.0</w:t>
             </w:r>
           </w:p>
         </w:tc>
@@ -1967,7 +1967,7 @@
                 <w:szCs w:val="20"/>
                 <w:rtl w:val="false"/>
               </w:rPr>
-              <w:t xml:space="preserve">Surfaces, sitting up on the ice.</w:t>
+              <w:t xml:space="preserve">Plants it on the rim of the iced latte. It wobbles.</w:t>
             </w:r>
           </w:p>
         </w:tc>
@@ -2028,7 +2028,7 @@
                 <w:szCs w:val="20"/>
                 <w:rtl w:val="false"/>
               </w:rPr>
-              <w:t xml:space="preserve">10.4–10.9</w:t>
+              <w:t xml:space="preserve">10.0–10.4</w:t>
             </w:r>
           </w:p>
         </w:tc>
@@ -2056,7 +2056,449 @@
                 <w:szCs w:val="20"/>
                 <w:rtl w:val="false"/>
               </w:rPr>
-              <w:t xml:space="preserve">Flops one leg over the rim, then the other; eyes close, happy grin. The line fades in.</w:t>
+              <w:t xml:space="preserve">A little hop over the rim, into the glass.</w:t>
+            </w:r>
+          </w:p>
+        </w:tc>
+        <w:tc>
+          <w:tcPr>
+            <w:tcW w:type="dxa" w:w="3150"/>
+            <w:shd w:fill="F7F6F1" w:color="auto" w:val="clear"/>
+            <w:tcMar>
+              <w:top w:type="dxa" w:w="80"/>
+              <w:left w:type="dxa" w:w="110"/>
+              <w:bottom w:type="dxa" w:w="80"/>
+              <w:right w:type="dxa" w:w="110"/>
+            </w:tcMar>
+          </w:tcPr>
+          <w:p>
+            <w:pPr>
+              <w:bidi w:val="false"/>
+              <w:spacing w:after="0"/>
+              <w:jc w:val="left"/>
+            </w:pPr>
+            <w:r>
+              <w:rPr>
+                <w:rFonts w:ascii="Calibri" w:cs="Calibri" w:eastAsia="Calibri" w:hAnsi="Calibri"/>
+                <w:b w:val="false"/>
+                <w:bCs w:val="false"/>
+                <w:sz w:val="20"/>
+                <w:szCs w:val="20"/>
+                <w:rtl w:val="false"/>
+              </w:rPr>
+              <w:t xml:space="preserve">—</w:t>
+            </w:r>
+          </w:p>
+        </w:tc>
+      </w:tr>
+      <w:tr>
+        <w:tc>
+          <w:tcPr>
+            <w:tcW w:type="dxa" w:w="1750"/>
+            <w:tcMar>
+              <w:top w:type="dxa" w:w="80"/>
+              <w:left w:type="dxa" w:w="110"/>
+              <w:bottom w:type="dxa" w:w="80"/>
+              <w:right w:type="dxa" w:w="110"/>
+            </w:tcMar>
+          </w:tcPr>
+          <w:p>
+            <w:pPr>
+              <w:bidi w:val="false"/>
+              <w:spacing w:after="0"/>
+              <w:jc w:val="left"/>
+            </w:pPr>
+            <w:r>
+              <w:rPr>
+                <w:rFonts w:ascii="Calibri" w:cs="Calibri" w:eastAsia="Calibri" w:hAnsi="Calibri"/>
+                <w:b/>
+                <w:bCs/>
+                <w:sz w:val="20"/>
+                <w:szCs w:val="20"/>
+                <w:rtl w:val="false"/>
+              </w:rPr>
+              <w:t xml:space="preserve">10.4–10.65</w:t>
+            </w:r>
+          </w:p>
+        </w:tc>
+        <w:tc>
+          <w:tcPr>
+            <w:tcW w:type="dxa" w:w="4450"/>
+            <w:tcMar>
+              <w:top w:type="dxa" w:w="80"/>
+              <w:left w:type="dxa" w:w="110"/>
+              <w:bottom w:type="dxa" w:w="80"/>
+              <w:right w:type="dxa" w:w="110"/>
+            </w:tcMar>
+          </w:tcPr>
+          <w:p>
+            <w:pPr>
+              <w:bidi w:val="false"/>
+              <w:spacing w:after="0"/>
+              <w:jc w:val="left"/>
+            </w:pPr>
+            <w:r>
+              <w:rPr>
+                <w:rFonts w:ascii="Calibri" w:cs="Calibri" w:eastAsia="Calibri" w:hAnsi="Calibri"/>
+                <w:sz w:val="20"/>
+                <w:szCs w:val="20"/>
+                <w:rtl w:val="false"/>
+              </w:rPr>
+              <w:t xml:space="preserve">Splash: drops fly up, ripples across the ice, the flag shakes. He is under.</w:t>
+            </w:r>
+          </w:p>
+        </w:tc>
+        <w:tc>
+          <w:tcPr>
+            <w:tcW w:type="dxa" w:w="3150"/>
+            <w:tcMar>
+              <w:top w:type="dxa" w:w="80"/>
+              <w:left w:type="dxa" w:w="110"/>
+              <w:bottom w:type="dxa" w:w="80"/>
+              <w:right w:type="dxa" w:w="110"/>
+            </w:tcMar>
+          </w:tcPr>
+          <w:p>
+            <w:pPr>
+              <w:bidi w:val="false"/>
+              <w:spacing w:after="0"/>
+              <w:jc w:val="left"/>
+            </w:pPr>
+            <w:r>
+              <w:rPr>
+                <w:rFonts w:ascii="Calibri" w:cs="Calibri" w:eastAsia="Calibri" w:hAnsi="Calibri"/>
+                <w:b w:val="false"/>
+                <w:bCs w:val="false"/>
+                <w:sz w:val="20"/>
+                <w:szCs w:val="20"/>
+                <w:rtl w:val="false"/>
+              </w:rPr>
+              <w:t xml:space="preserve">—</w:t>
+            </w:r>
+          </w:p>
+        </w:tc>
+      </w:tr>
+      <w:tr>
+        <w:tc>
+          <w:tcPr>
+            <w:tcW w:type="dxa" w:w="1750"/>
+            <w:shd w:fill="F7F6F1" w:color="auto" w:val="clear"/>
+            <w:tcMar>
+              <w:top w:type="dxa" w:w="80"/>
+              <w:left w:type="dxa" w:w="110"/>
+              <w:bottom w:type="dxa" w:w="80"/>
+              <w:right w:type="dxa" w:w="110"/>
+            </w:tcMar>
+          </w:tcPr>
+          <w:p>
+            <w:pPr>
+              <w:bidi w:val="false"/>
+              <w:spacing w:after="0"/>
+              <w:jc w:val="left"/>
+            </w:pPr>
+            <w:r>
+              <w:rPr>
+                <w:rFonts w:ascii="Calibri" w:cs="Calibri" w:eastAsia="Calibri" w:hAnsi="Calibri"/>
+                <w:b/>
+                <w:bCs/>
+                <w:sz w:val="20"/>
+                <w:szCs w:val="20"/>
+                <w:rtl w:val="false"/>
+              </w:rPr>
+              <w:t xml:space="preserve">10.65–11.4</w:t>
+            </w:r>
+          </w:p>
+        </w:tc>
+        <w:tc>
+          <w:tcPr>
+            <w:tcW w:type="dxa" w:w="4450"/>
+            <w:shd w:fill="F7F6F1" w:color="auto" w:val="clear"/>
+            <w:tcMar>
+              <w:top w:type="dxa" w:w="80"/>
+              <w:left w:type="dxa" w:w="110"/>
+              <w:bottom w:type="dxa" w:w="80"/>
+              <w:right w:type="dxa" w:w="110"/>
+            </w:tcMar>
+          </w:tcPr>
+          <w:p>
+            <w:pPr>
+              <w:bidi w:val="false"/>
+              <w:spacing w:after="0"/>
+              <w:jc w:val="left"/>
+            </w:pPr>
+            <w:r>
+              <w:rPr>
+                <w:rFonts w:ascii="Calibri" w:cs="Calibri" w:eastAsia="Calibri" w:hAnsi="Calibri"/>
+                <w:sz w:val="20"/>
+                <w:szCs w:val="20"/>
+                <w:rtl w:val="false"/>
+              </w:rPr>
+              <w:t xml:space="preserve">Surfaces, sits up on the ice, flops one leg over the rim, then the other.</w:t>
+            </w:r>
+          </w:p>
+        </w:tc>
+        <w:tc>
+          <w:tcPr>
+            <w:tcW w:type="dxa" w:w="3150"/>
+            <w:shd w:fill="F7F6F1" w:color="auto" w:val="clear"/>
+            <w:tcMar>
+              <w:top w:type="dxa" w:w="80"/>
+              <w:left w:type="dxa" w:w="110"/>
+              <w:bottom w:type="dxa" w:w="80"/>
+              <w:right w:type="dxa" w:w="110"/>
+            </w:tcMar>
+          </w:tcPr>
+          <w:p>
+            <w:pPr>
+              <w:bidi w:val="false"/>
+              <w:spacing w:after="0"/>
+              <w:jc w:val="left"/>
+            </w:pPr>
+            <w:r>
+              <w:rPr>
+                <w:rFonts w:ascii="Calibri" w:cs="Calibri" w:eastAsia="Calibri" w:hAnsi="Calibri"/>
+                <w:b w:val="false"/>
+                <w:bCs w:val="false"/>
+                <w:sz w:val="20"/>
+                <w:szCs w:val="20"/>
+                <w:rtl w:val="false"/>
+              </w:rPr>
+              <w:t xml:space="preserve">—</w:t>
+            </w:r>
+          </w:p>
+        </w:tc>
+      </w:tr>
+      <w:tr>
+        <w:tc>
+          <w:tcPr>
+            <w:tcW w:type="dxa" w:w="1750"/>
+            <w:tcMar>
+              <w:top w:type="dxa" w:w="80"/>
+              <w:left w:type="dxa" w:w="110"/>
+              <w:bottom w:type="dxa" w:w="80"/>
+              <w:right w:type="dxa" w:w="110"/>
+            </w:tcMar>
+          </w:tcPr>
+          <w:p>
+            <w:pPr>
+              <w:bidi w:val="false"/>
+              <w:spacing w:after="0"/>
+              <w:jc w:val="left"/>
+            </w:pPr>
+            <w:r>
+              <w:rPr>
+                <w:rFonts w:ascii="Calibri" w:cs="Calibri" w:eastAsia="Calibri" w:hAnsi="Calibri"/>
+                <w:b/>
+                <w:bCs/>
+                <w:sz w:val="20"/>
+                <w:szCs w:val="20"/>
+                <w:rtl w:val="false"/>
+              </w:rPr>
+              <w:t xml:space="preserve">11.45–11.65</w:t>
+            </w:r>
+          </w:p>
+        </w:tc>
+        <w:tc>
+          <w:tcPr>
+            <w:tcW w:type="dxa" w:w="4450"/>
+            <w:tcMar>
+              <w:top w:type="dxa" w:w="80"/>
+              <w:left w:type="dxa" w:w="110"/>
+              <w:bottom w:type="dxa" w:w="80"/>
+              <w:right w:type="dxa" w:w="110"/>
+            </w:tcMar>
+          </w:tcPr>
+          <w:p>
+            <w:pPr>
+              <w:bidi w:val="false"/>
+              <w:spacing w:after="0"/>
+              <w:jc w:val="left"/>
+            </w:pPr>
+            <w:r>
+              <w:rPr>
+                <w:rFonts w:ascii="Calibri" w:cs="Calibri" w:eastAsia="Calibri" w:hAnsi="Calibri"/>
+                <w:sz w:val="20"/>
+                <w:szCs w:val="20"/>
+                <w:rtl w:val="false"/>
+              </w:rPr>
+              <w:t xml:space="preserve">Done with the ladder: pushes it with his foot.</w:t>
+            </w:r>
+          </w:p>
+        </w:tc>
+        <w:tc>
+          <w:tcPr>
+            <w:tcW w:type="dxa" w:w="3150"/>
+            <w:tcMar>
+              <w:top w:type="dxa" w:w="80"/>
+              <w:left w:type="dxa" w:w="110"/>
+              <w:bottom w:type="dxa" w:w="80"/>
+              <w:right w:type="dxa" w:w="110"/>
+            </w:tcMar>
+          </w:tcPr>
+          <w:p>
+            <w:pPr>
+              <w:bidi w:val="false"/>
+              <w:spacing w:after="0"/>
+              <w:jc w:val="left"/>
+            </w:pPr>
+            <w:r>
+              <w:rPr>
+                <w:rFonts w:ascii="Calibri" w:cs="Calibri" w:eastAsia="Calibri" w:hAnsi="Calibri"/>
+                <w:b w:val="false"/>
+                <w:bCs w:val="false"/>
+                <w:sz w:val="20"/>
+                <w:szCs w:val="20"/>
+                <w:rtl w:val="false"/>
+              </w:rPr>
+              <w:t xml:space="preserve">—</w:t>
+            </w:r>
+          </w:p>
+        </w:tc>
+      </w:tr>
+      <w:tr>
+        <w:tc>
+          <w:tcPr>
+            <w:tcW w:type="dxa" w:w="1750"/>
+            <w:shd w:fill="F7F6F1" w:color="auto" w:val="clear"/>
+            <w:tcMar>
+              <w:top w:type="dxa" w:w="80"/>
+              <w:left w:type="dxa" w:w="110"/>
+              <w:bottom w:type="dxa" w:w="80"/>
+              <w:right w:type="dxa" w:w="110"/>
+            </w:tcMar>
+          </w:tcPr>
+          <w:p>
+            <w:pPr>
+              <w:bidi w:val="false"/>
+              <w:spacing w:after="0"/>
+              <w:jc w:val="left"/>
+            </w:pPr>
+            <w:r>
+              <w:rPr>
+                <w:rFonts w:ascii="Calibri" w:cs="Calibri" w:eastAsia="Calibri" w:hAnsi="Calibri"/>
+                <w:b/>
+                <w:bCs/>
+                <w:sz w:val="20"/>
+                <w:szCs w:val="20"/>
+                <w:rtl w:val="false"/>
+              </w:rPr>
+              <w:t xml:space="preserve">11.65–12.4</w:t>
+            </w:r>
+          </w:p>
+        </w:tc>
+        <w:tc>
+          <w:tcPr>
+            <w:tcW w:type="dxa" w:w="4450"/>
+            <w:shd w:fill="F7F6F1" w:color="auto" w:val="clear"/>
+            <w:tcMar>
+              <w:top w:type="dxa" w:w="80"/>
+              <w:left w:type="dxa" w:w="110"/>
+              <w:bottom w:type="dxa" w:w="80"/>
+              <w:right w:type="dxa" w:w="110"/>
+            </w:tcMar>
+          </w:tcPr>
+          <w:p>
+            <w:pPr>
+              <w:bidi w:val="false"/>
+              <w:spacing w:after="0"/>
+              <w:jc w:val="left"/>
+            </w:pPr>
+            <w:r>
+              <w:rPr>
+                <w:rFonts w:ascii="Calibri" w:cs="Calibri" w:eastAsia="Calibri" w:hAnsi="Calibri"/>
+                <w:sz w:val="20"/>
+                <w:szCs w:val="20"/>
+                <w:rtl w:val="false"/>
+              </w:rPr>
+              <w:t xml:space="preserve">The ladder tips over and clatters onto the counter. The flag stays on his drink.</w:t>
+            </w:r>
+          </w:p>
+        </w:tc>
+        <w:tc>
+          <w:tcPr>
+            <w:tcW w:type="dxa" w:w="3150"/>
+            <w:shd w:fill="F7F6F1" w:color="auto" w:val="clear"/>
+            <w:tcMar>
+              <w:top w:type="dxa" w:w="80"/>
+              <w:left w:type="dxa" w:w="110"/>
+              <w:bottom w:type="dxa" w:w="80"/>
+              <w:right w:type="dxa" w:w="110"/>
+            </w:tcMar>
+          </w:tcPr>
+          <w:p>
+            <w:pPr>
+              <w:bidi w:val="false"/>
+              <w:spacing w:after="0"/>
+              <w:jc w:val="left"/>
+            </w:pPr>
+            <w:r>
+              <w:rPr>
+                <w:rFonts w:ascii="Calibri" w:cs="Calibri" w:eastAsia="Calibri" w:hAnsi="Calibri"/>
+                <w:b w:val="false"/>
+                <w:bCs w:val="false"/>
+                <w:sz w:val="20"/>
+                <w:szCs w:val="20"/>
+                <w:rtl w:val="false"/>
+              </w:rPr>
+              <w:t xml:space="preserve">—</w:t>
+            </w:r>
+          </w:p>
+        </w:tc>
+      </w:tr>
+      <w:tr>
+        <w:tc>
+          <w:tcPr>
+            <w:tcW w:type="dxa" w:w="1750"/>
+            <w:tcMar>
+              <w:top w:type="dxa" w:w="80"/>
+              <w:left w:type="dxa" w:w="110"/>
+              <w:bottom w:type="dxa" w:w="80"/>
+              <w:right w:type="dxa" w:w="110"/>
+            </w:tcMar>
+          </w:tcPr>
+          <w:p>
+            <w:pPr>
+              <w:bidi w:val="false"/>
+              <w:spacing w:after="0"/>
+              <w:jc w:val="left"/>
+            </w:pPr>
+            <w:r>
+              <w:rPr>
+                <w:rFonts w:ascii="Calibri" w:cs="Calibri" w:eastAsia="Calibri" w:hAnsi="Calibri"/>
+                <w:b/>
+                <w:bCs/>
+                <w:sz w:val="20"/>
+                <w:szCs w:val="20"/>
+                <w:rtl w:val="false"/>
+              </w:rPr>
+              <w:t xml:space="preserve">12.25–12.75</w:t>
+            </w:r>
+          </w:p>
+        </w:tc>
+        <w:tc>
+          <w:tcPr>
+            <w:tcW w:type="dxa" w:w="4450"/>
+            <w:tcMar>
+              <w:top w:type="dxa" w:w="80"/>
+              <w:left w:type="dxa" w:w="110"/>
+              <w:bottom w:type="dxa" w:w="80"/>
+              <w:right w:type="dxa" w:w="110"/>
+            </w:tcMar>
+          </w:tcPr>
+          <w:p>
+            <w:pPr>
+              <w:bidi w:val="false"/>
+              <w:spacing w:after="0"/>
+              <w:jc w:val="left"/>
+            </w:pPr>
+            <w:r>
+              <w:rPr>
+                <w:rFonts w:ascii="Calibri" w:cs="Calibri" w:eastAsia="Calibri" w:hAnsi="Calibri"/>
+                <w:sz w:val="20"/>
+                <w:szCs w:val="20"/>
+                <w:rtl w:val="false"/>
+              </w:rPr>
+              <w:t xml:space="preserve">Eyes closed, happy grin. The line fades in.</w:t>
             </w:r>
           </w:p>
         </w:tc>
@@ -2115,62 +2557,65 @@
         <w:tc>
           <w:tcPr>
             <w:tcW w:type="dxa" w:w="1750"/>
-            <w:tcMar>
-              <w:top w:type="dxa" w:w="80"/>
-              <w:left w:type="dxa" w:w="110"/>
-              <w:bottom w:type="dxa" w:w="80"/>
-              <w:right w:type="dxa" w:w="110"/>
-            </w:tcMar>
-          </w:tcPr>
-          <w:p>
-            <w:pPr>
-              <w:bidi w:val="false"/>
-              <w:spacing w:after="0"/>
-              <w:jc w:val="left"/>
-            </w:pPr>
-            <w:r>
-              <w:rPr>
-                <w:rFonts w:ascii="Calibri" w:cs="Calibri" w:eastAsia="Calibri" w:hAnsi="Calibri"/>
-                <w:b/>
-                <w:bCs/>
-                <w:sz w:val="20"/>
-                <w:szCs w:val="20"/>
-                <w:rtl w:val="false"/>
-              </w:rPr>
-              <w:t xml:space="preserve">10.9–13.7</w:t>
+            <w:shd w:fill="F7F6F1" w:color="auto" w:val="clear"/>
+            <w:tcMar>
+              <w:top w:type="dxa" w:w="80"/>
+              <w:left w:type="dxa" w:w="110"/>
+              <w:bottom w:type="dxa" w:w="80"/>
+              <w:right w:type="dxa" w:w="110"/>
+            </w:tcMar>
+          </w:tcPr>
+          <w:p>
+            <w:pPr>
+              <w:bidi w:val="false"/>
+              <w:spacing w:after="0"/>
+              <w:jc w:val="left"/>
+            </w:pPr>
+            <w:r>
+              <w:rPr>
+                <w:rFonts w:ascii="Calibri" w:cs="Calibri" w:eastAsia="Calibri" w:hAnsi="Calibri"/>
+                <w:b/>
+                <w:bCs/>
+                <w:sz w:val="20"/>
+                <w:szCs w:val="20"/>
+                <w:rtl w:val="false"/>
+              </w:rPr>
+              <w:t xml:space="preserve">12.75–15.6</w:t>
             </w:r>
           </w:p>
         </w:tc>
         <w:tc>
           <w:tcPr>
             <w:tcW w:type="dxa" w:w="4450"/>
-            <w:tcMar>
-              <w:top w:type="dxa" w:w="80"/>
-              <w:left w:type="dxa" w:w="110"/>
-              <w:bottom w:type="dxa" w:w="80"/>
-              <w:right w:type="dxa" w:w="110"/>
-            </w:tcMar>
-          </w:tcPr>
-          <w:p>
-            <w:pPr>
-              <w:bidi w:val="false"/>
-              <w:spacing w:after="0"/>
-              <w:jc w:val="left"/>
-            </w:pPr>
-            <w:r>
-              <w:rPr>
-                <w:rFonts w:ascii="Calibri" w:cs="Calibri" w:eastAsia="Calibri" w:hAnsi="Calibri"/>
-                <w:sz w:val="20"/>
-                <w:szCs w:val="20"/>
-                <w:rtl w:val="false"/>
-              </w:rPr>
-              <w:t xml:space="preserve">Holds (~3s to read): he lounges, feet swinging gently.</w:t>
+            <w:shd w:fill="F7F6F1" w:color="auto" w:val="clear"/>
+            <w:tcMar>
+              <w:top w:type="dxa" w:w="80"/>
+              <w:left w:type="dxa" w:w="110"/>
+              <w:bottom w:type="dxa" w:w="80"/>
+              <w:right w:type="dxa" w:w="110"/>
+            </w:tcMar>
+          </w:tcPr>
+          <w:p>
+            <w:pPr>
+              <w:bidi w:val="false"/>
+              <w:spacing w:after="0"/>
+              <w:jc w:val="left"/>
+            </w:pPr>
+            <w:r>
+              <w:rPr>
+                <w:rFonts w:ascii="Calibri" w:cs="Calibri" w:eastAsia="Calibri" w:hAnsi="Calibri"/>
+                <w:sz w:val="20"/>
+                <w:szCs w:val="20"/>
+                <w:rtl w:val="false"/>
+              </w:rPr>
+              <w:t xml:space="preserve">Holds (~3s to read): he lounges, feet swinging, the flag waving beside him.</w:t>
             </w:r>
           </w:p>
         </w:tc>
         <w:tc>
           <w:tcPr>
             <w:tcW w:type="dxa" w:w="3150"/>
+            <w:shd w:fill="F7F6F1" w:color="auto" w:val="clear"/>
             <w:tcMar>
               <w:top w:type="dxa" w:w="80"/>
               <w:left w:type="dxa" w:w="110"/>
@@ -2193,7 +2638,7 @@
                 <w:szCs w:val="20"/>
                 <w:rtl w:val="false"/>
               </w:rPr>
-              <w:t xml:space="preserve">Line held, fades out at 13.5–13.9</w:t>
+              <w:t xml:space="preserve">Line held, fades out at 15.4–15.8</w:t>
             </w:r>
           </w:p>
         </w:tc>
@@ -2202,37 +2647,35 @@
         <w:tc>
           <w:tcPr>
             <w:tcW w:type="dxa" w:w="1750"/>
-            <w:shd w:fill="F7F6F1" w:color="auto" w:val="clear"/>
-            <w:tcMar>
-              <w:top w:type="dxa" w:w="80"/>
-              <w:left w:type="dxa" w:w="110"/>
-              <w:bottom w:type="dxa" w:w="80"/>
-              <w:right w:type="dxa" w:w="110"/>
-            </w:tcMar>
-          </w:tcPr>
-          <w:p>
-            <w:pPr>
-              <w:bidi w:val="false"/>
-              <w:spacing w:after="0"/>
-              <w:jc w:val="left"/>
-            </w:pPr>
-            <w:r>
-              <w:rPr>
-                <w:rFonts w:ascii="Calibri" w:cs="Calibri" w:eastAsia="Calibri" w:hAnsi="Calibri"/>
-                <w:b/>
-                <w:bCs/>
-                <w:sz w:val="20"/>
-                <w:szCs w:val="20"/>
-                <w:rtl w:val="false"/>
-              </w:rPr>
-              <w:t xml:space="preserve">13.7–14.3</w:t>
+            <w:tcMar>
+              <w:top w:type="dxa" w:w="80"/>
+              <w:left w:type="dxa" w:w="110"/>
+              <w:bottom w:type="dxa" w:w="80"/>
+              <w:right w:type="dxa" w:w="110"/>
+            </w:tcMar>
+          </w:tcPr>
+          <w:p>
+            <w:pPr>
+              <w:bidi w:val="false"/>
+              <w:spacing w:after="0"/>
+              <w:jc w:val="left"/>
+            </w:pPr>
+            <w:r>
+              <w:rPr>
+                <w:rFonts w:ascii="Calibri" w:cs="Calibri" w:eastAsia="Calibri" w:hAnsi="Calibri"/>
+                <w:b/>
+                <w:bCs/>
+                <w:sz w:val="20"/>
+                <w:szCs w:val="20"/>
+                <w:rtl w:val="false"/>
+              </w:rPr>
+              <w:t xml:space="preserve">15.6–16.2</w:t>
             </w:r>
           </w:p>
         </w:tc>
         <w:tc>
           <w:tcPr>
             <w:tcW w:type="dxa" w:w="4450"/>
-            <w:shd w:fill="F7F6F1" w:color="auto" w:val="clear"/>
             <w:tcMar>
               <w:top w:type="dxa" w:w="80"/>
               <w:left w:type="dxa" w:w="110"/>
@@ -2260,7 +2703,6 @@
         <w:tc>
           <w:tcPr>
             <w:tcW w:type="dxa" w:w="3150"/>
-            <w:shd w:fill="F7F6F1" w:color="auto" w:val="clear"/>
             <w:tcMar>
               <w:top w:type="dxa" w:w="80"/>
               <w:left w:type="dxa" w:w="110"/>
@@ -2292,56 +2734,58 @@
         <w:tc>
           <w:tcPr>
             <w:tcW w:type="dxa" w:w="1750"/>
-            <w:tcMar>
-              <w:top w:type="dxa" w:w="80"/>
-              <w:left w:type="dxa" w:w="110"/>
-              <w:bottom w:type="dxa" w:w="80"/>
-              <w:right w:type="dxa" w:w="110"/>
-            </w:tcMar>
-          </w:tcPr>
-          <w:p>
-            <w:pPr>
-              <w:bidi w:val="false"/>
-              <w:spacing w:after="0"/>
-              <w:jc w:val="left"/>
-            </w:pPr>
-            <w:r>
-              <w:rPr>
-                <w:rFonts w:ascii="Calibri" w:cs="Calibri" w:eastAsia="Calibri" w:hAnsi="Calibri"/>
-                <w:b/>
-                <w:bCs/>
-                <w:sz w:val="20"/>
-                <w:szCs w:val="20"/>
-                <w:rtl w:val="false"/>
-              </w:rPr>
-              <w:t xml:space="preserve">14.3–16.6</w:t>
+            <w:shd w:fill="F7F6F1" w:color="auto" w:val="clear"/>
+            <w:tcMar>
+              <w:top w:type="dxa" w:w="80"/>
+              <w:left w:type="dxa" w:w="110"/>
+              <w:bottom w:type="dxa" w:w="80"/>
+              <w:right w:type="dxa" w:w="110"/>
+            </w:tcMar>
+          </w:tcPr>
+          <w:p>
+            <w:pPr>
+              <w:bidi w:val="false"/>
+              <w:spacing w:after="0"/>
+              <w:jc w:val="left"/>
+            </w:pPr>
+            <w:r>
+              <w:rPr>
+                <w:rFonts w:ascii="Calibri" w:cs="Calibri" w:eastAsia="Calibri" w:hAnsi="Calibri"/>
+                <w:b/>
+                <w:bCs/>
+                <w:sz w:val="20"/>
+                <w:szCs w:val="20"/>
+                <w:rtl w:val="false"/>
+              </w:rPr>
+              <w:t xml:space="preserve">16.2–18.5</w:t>
             </w:r>
           </w:p>
         </w:tc>
         <w:tc>
           <w:tcPr>
             <w:tcW w:type="dxa" w:w="4450"/>
-            <w:tcMar>
-              <w:top w:type="dxa" w:w="80"/>
-              <w:left w:type="dxa" w:w="110"/>
-              <w:bottom w:type="dxa" w:w="80"/>
-              <w:right w:type="dxa" w:w="110"/>
-            </w:tcMar>
-          </w:tcPr>
-          <w:p>
-            <w:pPr>
-              <w:bidi w:val="false"/>
-              <w:spacing w:after="0"/>
-              <w:jc w:val="left"/>
-            </w:pPr>
-            <w:r>
-              <w:rPr>
-                <w:rFonts w:ascii="Calibri" w:cs="Calibri" w:eastAsia="Calibri" w:hAnsi="Calibri"/>
-                <w:sz w:val="20"/>
-                <w:szCs w:val="20"/>
-                <w:rtl w:val="false"/>
-              </w:rPr>
-              <w:t xml:space="preserve">Holds (~2.5s to read).</w:t>
+            <w:shd w:fill="F7F6F1" w:color="auto" w:val="clear"/>
+            <w:tcMar>
+              <w:top w:type="dxa" w:w="80"/>
+              <w:left w:type="dxa" w:w="110"/>
+              <w:bottom w:type="dxa" w:w="80"/>
+              <w:right w:type="dxa" w:w="110"/>
+            </w:tcMar>
+          </w:tcPr>
+          <w:p>
+            <w:pPr>
+              <w:bidi w:val="false"/>
+              <w:spacing w:after="0"/>
+              <w:jc w:val="left"/>
+            </w:pPr>
+            <w:r>
+              <w:rPr>
+                <w:rFonts w:ascii="Calibri" w:cs="Calibri" w:eastAsia="Calibri" w:hAnsi="Calibri"/>
+                <w:sz w:val="20"/>
+                <w:szCs w:val="20"/>
+                <w:rtl w:val="false"/>
+              </w:rPr>
+              <w:t xml:space="preserve">Holds (~2.3s to read).</w:t>
             </w:r>
           </w:p>
         </w:tc>

</xml_diff>

<commit_message>
Ep.1 ladder: pocket flag, pool float, delicious drinks, green badges
- 24% badge light green, 92% badge dark green
- plate graded (enhance.py → plates/iced-hot-v2.jpg): richer crema and
  swirl, sheen, condensation on the iced glass; animated steam off the
  cappuccino
- the flag is no longer on the ladder: at the top he pulls it from his
  pocket, it snaps open above him, he plants it on the rim
- after pushing the ladder he slides back in and floats like a pool
- sound cues follow (events.js); previous cut kept as reel-ladder-flag-v1.js

Co-Authored-By: Claude Opus 5.5 <noreply@anthropic.com>
Claude-Session: https://claude.ai/code/session_01UCKVHF8Bj15Neb29ir5cAN
</commit_message>
<xml_diff>
--- a/marketing/posts/found-my-coffee/export/ep1-ladder-script.docx
+++ b/marketing/posts/found-my-coffee/export/ep1-ladder-script.docx
@@ -73,7 +73,7 @@
           <w:szCs w:val="20"/>
           <w:rtl w:val="false"/>
         </w:rPr>
-        <w:t xml:space="preserve">18.5s · 9:16 vertical · with music and sound effects. Same café, two drinks on a dark wooden counter: a hot cappuccino (right) and an iced latte in a short glass (left). A slow push-in runs through the whole piece.</w:t>
+        <w:t xml:space="preserve">19s · 9:16 vertical · with music and sound effects. Same café, two drinks on a dark wooden counter: a hot cappuccino (right) and an iced latte in a short glass (left). A slow push-in runs through the whole piece.</w:t>
       </w:r>
     </w:p>
     <w:tbl>
@@ -560,7 +560,7 @@
                 <w:szCs w:val="20"/>
                 <w:rtl w:val="false"/>
               </w:rPr>
-              <w:t xml:space="preserve">(grey badge)</w:t>
+              <w:t xml:space="preserve">(light green badge)</w:t>
             </w:r>
           </w:p>
         </w:tc>
@@ -1111,7 +1111,7 @@
                 <w:szCs w:val="20"/>
                 <w:rtl w:val="false"/>
               </w:rPr>
-              <w:t xml:space="preserve">(green badge)</w:t>
+              <w:t xml:space="preserve">(dark green badge)</w:t>
             </w:r>
           </w:p>
         </w:tc>
@@ -1436,7 +1436,7 @@
                 <w:szCs w:val="20"/>
                 <w:rtl w:val="false"/>
               </w:rPr>
-              <w:t xml:space="preserve">Pulls a folded ladder straight out of the pouch; a rolled-up green flag is tied to its top.</w:t>
+              <w:t xml:space="preserve">Pulls a folded ladder straight out of the pouch.</w:t>
             </w:r>
           </w:p>
         </w:tc>
@@ -1613,7 +1613,7 @@
                 <w:szCs w:val="20"/>
                 <w:rtl w:val="false"/>
               </w:rPr>
-              <w:t xml:space="preserve">The ladder extends up to the rim in three clicks; on the last one the flag snaps open: the BrewMaps flag.</w:t>
+              <w:t xml:space="preserve">The ladder extends up to the rim in three clicks.</w:t>
             </w:r>
           </w:p>
         </w:tc>
@@ -1642,7 +1642,7 @@
                 <w:szCs w:val="20"/>
                 <w:rtl w:val="false"/>
               </w:rPr>
-              <w:t xml:space="preserve">BrewMaps flag</w:t>
+              <w:t xml:space="preserve">—</w:t>
             </w:r>
           </w:p>
         </w:tc>
@@ -1702,7 +1702,7 @@
                 <w:szCs w:val="20"/>
                 <w:rtl w:val="false"/>
               </w:rPr>
-              <w:t xml:space="preserve">Climbs it rung by rung, the flag flying over the glass.</w:t>
+              <w:t xml:space="preserve">Climbs it rung by rung.</w:t>
             </w:r>
           </w:p>
         </w:tc>
@@ -1763,7 +1763,7 @@
                 <w:szCs w:val="20"/>
                 <w:rtl w:val="false"/>
               </w:rPr>
-              <w:t xml:space="preserve">9.6–9.75</w:t>
+              <w:t xml:space="preserve">9.6–9.76</w:t>
             </w:r>
           </w:p>
         </w:tc>
@@ -1790,7 +1790,7 @@
                 <w:szCs w:val="20"/>
                 <w:rtl w:val="false"/>
               </w:rPr>
-              <w:t xml:space="preserve">At the top he takes the flag off the ladder.</w:t>
+              <w:t xml:space="preserve">At the top, one hand on the ladder, he reaches into his pocket.</w:t>
             </w:r>
           </w:p>
         </w:tc>
@@ -1851,7 +1851,7 @@
                 <w:szCs w:val="20"/>
                 <w:rtl w:val="false"/>
               </w:rPr>
-              <w:t xml:space="preserve">9.75–9.9</w:t>
+              <w:t xml:space="preserve">9.76–9.96</w:t>
             </w:r>
           </w:p>
         </w:tc>
@@ -1879,7 +1879,7 @@
                 <w:szCs w:val="20"/>
                 <w:rtl w:val="false"/>
               </w:rPr>
-              <w:t xml:space="preserve">Raises it over his head like a summit flag.</w:t>
+              <w:t xml:space="preserve">Pulls out a tiny rolled-up flag; its pole telescopes as he raises it out over the glass.</w:t>
             </w:r>
           </w:p>
         </w:tc>
@@ -1940,7 +1940,7 @@
                 <w:szCs w:val="20"/>
                 <w:rtl w:val="false"/>
               </w:rPr>
-              <w:t xml:space="preserve">9.9–10.0</w:t>
+              <w:t xml:space="preserve">9.96–10.12</w:t>
             </w:r>
           </w:p>
         </w:tc>
@@ -1967,7 +1967,7 @@
                 <w:szCs w:val="20"/>
                 <w:rtl w:val="false"/>
               </w:rPr>
-              <w:t xml:space="preserve">Plants it on the rim of the iced latte. It wobbles.</w:t>
+              <w:t xml:space="preserve">The flag snaps open above him: the BrewMaps flag.</w:t>
             </w:r>
           </w:p>
         </w:tc>
@@ -1996,7 +1996,7 @@
                 <w:szCs w:val="20"/>
                 <w:rtl w:val="false"/>
               </w:rPr>
-              <w:t xml:space="preserve">—</w:t>
+              <w:t xml:space="preserve">BrewMaps flag</w:t>
             </w:r>
           </w:p>
         </w:tc>
@@ -2028,7 +2028,7 @@
                 <w:szCs w:val="20"/>
                 <w:rtl w:val="false"/>
               </w:rPr>
-              <w:t xml:space="preserve">10.0–10.4</w:t>
+              <w:t xml:space="preserve">10.16–10.28</w:t>
             </w:r>
           </w:p>
         </w:tc>
@@ -2056,7 +2056,7 @@
                 <w:szCs w:val="20"/>
                 <w:rtl w:val="false"/>
               </w:rPr>
-              <w:t xml:space="preserve">A little hop over the rim, into the glass.</w:t>
+              <w:t xml:space="preserve">Plants it on the rim of the iced latte. It wobbles.</w:t>
             </w:r>
           </w:p>
         </w:tc>
@@ -2117,7 +2117,7 @@
                 <w:szCs w:val="20"/>
                 <w:rtl w:val="false"/>
               </w:rPr>
-              <w:t xml:space="preserve">10.4–10.65</w:t>
+              <w:t xml:space="preserve">10.4–10.76</w:t>
             </w:r>
           </w:p>
         </w:tc>
@@ -2144,7 +2144,7 @@
                 <w:szCs w:val="20"/>
                 <w:rtl w:val="false"/>
               </w:rPr>
-              <w:t xml:space="preserve">Splash: drops fly up, ripples across the ice, the flag shakes. He is under.</w:t>
+              <w:t xml:space="preserve">A little hop over the rim, into the glass.</w:t>
             </w:r>
           </w:p>
         </w:tc>
@@ -2205,7 +2205,7 @@
                 <w:szCs w:val="20"/>
                 <w:rtl w:val="false"/>
               </w:rPr>
-              <w:t xml:space="preserve">10.65–11.4</w:t>
+              <w:t xml:space="preserve">10.76–11.0</w:t>
             </w:r>
           </w:p>
         </w:tc>
@@ -2233,7 +2233,7 @@
                 <w:szCs w:val="20"/>
                 <w:rtl w:val="false"/>
               </w:rPr>
-              <w:t xml:space="preserve">Surfaces, sits up on the ice, flops one leg over the rim, then the other.</w:t>
+              <w:t xml:space="preserve">Splash: drops fly up, ripples across the ice, the flag shakes. He is under.</w:t>
             </w:r>
           </w:p>
         </w:tc>
@@ -2294,7 +2294,7 @@
                 <w:szCs w:val="20"/>
                 <w:rtl w:val="false"/>
               </w:rPr>
-              <w:t xml:space="preserve">11.45–11.65</w:t>
+              <w:t xml:space="preserve">11.0–11.75</w:t>
             </w:r>
           </w:p>
         </w:tc>
@@ -2321,7 +2321,7 @@
                 <w:szCs w:val="20"/>
                 <w:rtl w:val="false"/>
               </w:rPr>
-              <w:t xml:space="preserve">Done with the ladder: pushes it with his foot.</w:t>
+              <w:t xml:space="preserve">Surfaces, sits up on the ice, flops one leg over the rim, then the other.</w:t>
             </w:r>
           </w:p>
         </w:tc>
@@ -2382,7 +2382,7 @@
                 <w:szCs w:val="20"/>
                 <w:rtl w:val="false"/>
               </w:rPr>
-              <w:t xml:space="preserve">11.65–12.4</w:t>
+              <w:t xml:space="preserve">11.8–12.0</w:t>
             </w:r>
           </w:p>
         </w:tc>
@@ -2410,7 +2410,7 @@
                 <w:szCs w:val="20"/>
                 <w:rtl w:val="false"/>
               </w:rPr>
-              <w:t xml:space="preserve">The ladder tips over and clatters onto the counter. The flag stays on his drink.</w:t>
+              <w:t xml:space="preserve">Done with the ladder: pushes it with his foot.</w:t>
             </w:r>
           </w:p>
         </w:tc>
@@ -2471,7 +2471,7 @@
                 <w:szCs w:val="20"/>
                 <w:rtl w:val="false"/>
               </w:rPr>
-              <w:t xml:space="preserve">12.25–12.75</w:t>
+              <w:t xml:space="preserve">12.0–12.7</w:t>
             </w:r>
           </w:p>
         </w:tc>
@@ -2498,7 +2498,184 @@
                 <w:szCs w:val="20"/>
                 <w:rtl w:val="false"/>
               </w:rPr>
-              <w:t xml:space="preserve">Eyes closed, happy grin. The line fades in.</w:t>
+              <w:t xml:space="preserve">The ladder tips over and clatters onto the counter. The flag stays on his drink.</w:t>
+            </w:r>
+          </w:p>
+        </w:tc>
+        <w:tc>
+          <w:tcPr>
+            <w:tcW w:type="dxa" w:w="3150"/>
+            <w:tcMar>
+              <w:top w:type="dxa" w:w="80"/>
+              <w:left w:type="dxa" w:w="110"/>
+              <w:bottom w:type="dxa" w:w="80"/>
+              <w:right w:type="dxa" w:w="110"/>
+            </w:tcMar>
+          </w:tcPr>
+          <w:p>
+            <w:pPr>
+              <w:bidi w:val="false"/>
+              <w:spacing w:after="0"/>
+              <w:jc w:val="left"/>
+            </w:pPr>
+            <w:r>
+              <w:rPr>
+                <w:rFonts w:ascii="Calibri" w:cs="Calibri" w:eastAsia="Calibri" w:hAnsi="Calibri"/>
+                <w:b w:val="false"/>
+                <w:bCs w:val="false"/>
+                <w:sz w:val="20"/>
+                <w:szCs w:val="20"/>
+                <w:rtl w:val="false"/>
+              </w:rPr>
+              <w:t xml:space="preserve">—</w:t>
+            </w:r>
+          </w:p>
+        </w:tc>
+      </w:tr>
+      <w:tr>
+        <w:tc>
+          <w:tcPr>
+            <w:tcW w:type="dxa" w:w="1750"/>
+            <w:shd w:fill="F7F6F1" w:color="auto" w:val="clear"/>
+            <w:tcMar>
+              <w:top w:type="dxa" w:w="80"/>
+              <w:left w:type="dxa" w:w="110"/>
+              <w:bottom w:type="dxa" w:w="80"/>
+              <w:right w:type="dxa" w:w="110"/>
+            </w:tcMar>
+          </w:tcPr>
+          <w:p>
+            <w:pPr>
+              <w:bidi w:val="false"/>
+              <w:spacing w:after="0"/>
+              <w:jc w:val="left"/>
+            </w:pPr>
+            <w:r>
+              <w:rPr>
+                <w:rFonts w:ascii="Calibri" w:cs="Calibri" w:eastAsia="Calibri" w:hAnsi="Calibri"/>
+                <w:b/>
+                <w:bCs/>
+                <w:sz w:val="20"/>
+                <w:szCs w:val="20"/>
+                <w:rtl w:val="false"/>
+              </w:rPr>
+              <w:t xml:space="preserve">12.58–13.18</w:t>
+            </w:r>
+          </w:p>
+        </w:tc>
+        <w:tc>
+          <w:tcPr>
+            <w:tcW w:type="dxa" w:w="4450"/>
+            <w:shd w:fill="F7F6F1" w:color="auto" w:val="clear"/>
+            <w:tcMar>
+              <w:top w:type="dxa" w:w="80"/>
+              <w:left w:type="dxa" w:w="110"/>
+              <w:bottom w:type="dxa" w:w="80"/>
+              <w:right w:type="dxa" w:w="110"/>
+            </w:tcMar>
+          </w:tcPr>
+          <w:p>
+            <w:pPr>
+              <w:bidi w:val="false"/>
+              <w:spacing w:after="0"/>
+              <w:jc w:val="left"/>
+            </w:pPr>
+            <w:r>
+              <w:rPr>
+                <w:rFonts w:ascii="Calibri" w:cs="Calibri" w:eastAsia="Calibri" w:hAnsi="Calibri"/>
+                <w:sz w:val="20"/>
+                <w:szCs w:val="20"/>
+                <w:rtl w:val="false"/>
+              </w:rPr>
+              <w:t xml:space="preserve">He slides back into the coffee and floats on his back like it is a pool: head on the rim, knees up, eyes closed.</w:t>
+            </w:r>
+          </w:p>
+        </w:tc>
+        <w:tc>
+          <w:tcPr>
+            <w:tcW w:type="dxa" w:w="3150"/>
+            <w:shd w:fill="F7F6F1" w:color="auto" w:val="clear"/>
+            <w:tcMar>
+              <w:top w:type="dxa" w:w="80"/>
+              <w:left w:type="dxa" w:w="110"/>
+              <w:bottom w:type="dxa" w:w="80"/>
+              <w:right w:type="dxa" w:w="110"/>
+            </w:tcMar>
+          </w:tcPr>
+          <w:p>
+            <w:pPr>
+              <w:bidi w:val="false"/>
+              <w:spacing w:after="0"/>
+              <w:jc w:val="left"/>
+            </w:pPr>
+            <w:r>
+              <w:rPr>
+                <w:rFonts w:ascii="Calibri" w:cs="Calibri" w:eastAsia="Calibri" w:hAnsi="Calibri"/>
+                <w:b w:val="false"/>
+                <w:bCs w:val="false"/>
+                <w:sz w:val="20"/>
+                <w:szCs w:val="20"/>
+                <w:rtl w:val="false"/>
+              </w:rPr>
+              <w:t xml:space="preserve">—</w:t>
+            </w:r>
+          </w:p>
+        </w:tc>
+      </w:tr>
+      <w:tr>
+        <w:tc>
+          <w:tcPr>
+            <w:tcW w:type="dxa" w:w="1750"/>
+            <w:tcMar>
+              <w:top w:type="dxa" w:w="80"/>
+              <w:left w:type="dxa" w:w="110"/>
+              <w:bottom w:type="dxa" w:w="80"/>
+              <w:right w:type="dxa" w:w="110"/>
+            </w:tcMar>
+          </w:tcPr>
+          <w:p>
+            <w:pPr>
+              <w:bidi w:val="false"/>
+              <w:spacing w:after="0"/>
+              <w:jc w:val="left"/>
+            </w:pPr>
+            <w:r>
+              <w:rPr>
+                <w:rFonts w:ascii="Calibri" w:cs="Calibri" w:eastAsia="Calibri" w:hAnsi="Calibri"/>
+                <w:b/>
+                <w:bCs/>
+                <w:sz w:val="20"/>
+                <w:szCs w:val="20"/>
+                <w:rtl w:val="false"/>
+              </w:rPr>
+              <w:t xml:space="preserve">13.05–13.55</w:t>
+            </w:r>
+          </w:p>
+        </w:tc>
+        <w:tc>
+          <w:tcPr>
+            <w:tcW w:type="dxa" w:w="4450"/>
+            <w:tcMar>
+              <w:top w:type="dxa" w:w="80"/>
+              <w:left w:type="dxa" w:w="110"/>
+              <w:bottom w:type="dxa" w:w="80"/>
+              <w:right w:type="dxa" w:w="110"/>
+            </w:tcMar>
+          </w:tcPr>
+          <w:p>
+            <w:pPr>
+              <w:bidi w:val="false"/>
+              <w:spacing w:after="0"/>
+              <w:jc w:val="left"/>
+            </w:pPr>
+            <w:r>
+              <w:rPr>
+                <w:rFonts w:ascii="Calibri" w:cs="Calibri" w:eastAsia="Calibri" w:hAnsi="Calibri"/>
+                <w:sz w:val="20"/>
+                <w:szCs w:val="20"/>
+                <w:rtl w:val="false"/>
+              </w:rPr>
+              <w:t xml:space="preserve">Lazy ripples around him. The line fades in.</w:t>
             </w:r>
           </w:p>
         </w:tc>
@@ -2580,7 +2757,7 @@
                 <w:szCs w:val="20"/>
                 <w:rtl w:val="false"/>
               </w:rPr>
-              <w:t xml:space="preserve">12.75–15.6</w:t>
+              <w:t xml:space="preserve">13.55–16.1</w:t>
             </w:r>
           </w:p>
         </w:tc>
@@ -2608,7 +2785,7 @@
                 <w:szCs w:val="20"/>
                 <w:rtl w:val="false"/>
               </w:rPr>
-              <w:t xml:space="preserve">Holds (~3s to read): he lounges, feet swinging, the flag waving beside him.</w:t>
+              <w:t xml:space="preserve">Holds (~3s to read): floating, bobbing gently, the flag waving beside him.</w:t>
             </w:r>
           </w:p>
         </w:tc>
@@ -2638,7 +2815,7 @@
                 <w:szCs w:val="20"/>
                 <w:rtl w:val="false"/>
               </w:rPr>
-              <w:t xml:space="preserve">Line held, fades out at 15.4–15.8</w:t>
+              <w:t xml:space="preserve">Line held, fades out at 15.9–16.3</w:t>
             </w:r>
           </w:p>
         </w:tc>
@@ -2669,7 +2846,7 @@
                 <w:szCs w:val="20"/>
                 <w:rtl w:val="false"/>
               </w:rPr>
-              <w:t xml:space="preserve">15.6–16.2</w:t>
+              <w:t xml:space="preserve">16.1–16.7</w:t>
             </w:r>
           </w:p>
         </w:tc>
@@ -2757,7 +2934,7 @@
                 <w:szCs w:val="20"/>
                 <w:rtl w:val="false"/>
               </w:rPr>
-              <w:t xml:space="preserve">16.2–18.5</w:t>
+              <w:t xml:space="preserve">16.7–19.0</w:t>
             </w:r>
           </w:p>
         </w:tc>

</xml_diff>

<commit_message>
Ep.1 ladder: relaxing at the pool's edge instead of asleep
After pushing the ladder he leans back on the far rim, elbows on the
edge, head back, eyes open and grinning, a knee out of the coffee.
The blend into the pose now also takes its eyes and mouth (it kept the
closed eyes before). Previous cut kept as reel-ladder-flag-v2.js.

Co-Authored-By: Claude Opus 5.5 <noreply@anthropic.com>
Claude-Session: https://claude.ai/code/session_01UCKVHF8Bj15Neb29ir5cAN
</commit_message>
<xml_diff>
--- a/marketing/posts/found-my-coffee/export/ep1-ladder-script.docx
+++ b/marketing/posts/found-my-coffee/export/ep1-ladder-script.docx
@@ -2587,7 +2587,7 @@
                 <w:szCs w:val="20"/>
                 <w:rtl w:val="false"/>
               </w:rPr>
-              <w:t xml:space="preserve">He slides back into the coffee and floats on his back like it is a pool: head on the rim, knees up, eyes closed.</w:t>
+              <w:t xml:space="preserve">He slides back into the coffee and relaxes like at a pool's edge: leaning back on the far rim, elbows on the edge, head back, eyes open, grinning, a knee out of the coffee.</w:t>
             </w:r>
           </w:p>
         </w:tc>
@@ -2785,7 +2785,7 @@
                 <w:szCs w:val="20"/>
                 <w:rtl w:val="false"/>
               </w:rPr>
-              <w:t xml:space="preserve">Holds (~3s to read): floating, bobbing gently, the flag waving beside him.</w:t>
+              <w:t xml:space="preserve">Holds (~3s to read): relaxing, bobbing gently, the flag waving beside him.</w:t>
             </w:r>
           </w:p>
         </w:tc>

</xml_diff>

<commit_message>
Ep.1: replace the final pose with a true back-float; clean payoff frame
- new float pose after the pool-float reference: lying on his back,
  head fallen back on a released neck, face to the sky, eyes closed,
  calm; both arms dropped outward past the cup with loose open hands;
  one leg straight, one slightly bent, feet falling outward; centred on
  the coffee, slightly smaller; below the coffee line he shows faintly
  through the glass
- one fixed pose: only the whole body drifts 1-2 px
- on landing the ladder, pouch and flag leave the frame; ladder clatter
  removed from the mix

Co-Authored-By: Claude Opus 5.5 <noreply@anthropic.com>
Claude-Session: https://claude.ai/code/session_01UCKVHF8Bj15Neb29ir5cAN
</commit_message>
<xml_diff>
--- a/marketing/posts/found-my-coffee/export/ep1-ladder-script.docx
+++ b/marketing/posts/found-my-coffee/export/ep1-ladder-script.docx
@@ -1789,7 +1789,7 @@
                 <w:szCs w:val="20"/>
                 <w:rtl w:val="false"/>
               </w:rPr>
-              <w:t xml:space="preserve">Splash. He lands floating across the coffee like a pool: head back, arms spread wide past the rim, open hands, legs loose. The ladder clatters onto the counter.</w:t>
+              <w:t xml:space="preserve">Splash. He lies back on the coffee like a pool: head fallen back, face to the sky, eyes closed; arms dropped out past both sides of the cup, hands open; legs loose under the surface. The ladder, pouch and flag are gone: the frame is suddenly clean.</w:t>
             </w:r>
           </w:p>
         </w:tc>
@@ -2076,7 +2076,7 @@
                 <w:szCs w:val="20"/>
                 <w:rtl w:val="false"/>
               </w:rPr>
-              <w:t xml:space="preserve">Holds (~3s): floating, the slowest bob, faint ripples; the camera eases in on him.</w:t>
+              <w:t xml:space="preserve">Holds (~3s): the pose never changes; the whole body drifts 1–2 px; faint ripples; the camera eases in on him.</w:t>
             </w:r>
           </w:p>
         </w:tc>

</xml_diff>

<commit_message>
Ep.1: the fall is one continuous figure tipping into the float
Every joint blends from his standing pose at the top of the ladder
(standJoints, same IK as drawCharacter) into the traced float pose, on
ones, with the head lagging so it whips back last. The planted flag now
always sits behind him; the ladder goes as his feet leave it; the props
fade out over 0.2s on the splash; the camera holds until he's settled.
Fall lengthened by 0.1s (reel 15.3s).

Co-Authored-By: Claude Fable 5.1 <noreply@anthropic.com>
Claude-Session: https://claude.ai/code/session_01UCKVHF8Bj15Neb29ir5cAN
</commit_message>
<xml_diff>
--- a/marketing/posts/found-my-coffee/export/ep1-ladder-script.docx
+++ b/marketing/posts/found-my-coffee/export/ep1-ladder-script.docx
@@ -73,7 +73,7 @@
           <w:szCs w:val="20"/>
           <w:rtl w:val="false"/>
         </w:rPr>
-        <w:t xml:space="preserve">15.2s · 9:16 vertical · with music and sound effects. Same café, two drinks on a dark wooden counter: a hot cappuccino (right) and an iced latte in a short glass (left). First half fast (search, effort, find), then he flops back into the iced latte and floats like it is a pool.</w:t>
+        <w:t xml:space="preserve">15.3s · 9:16 vertical · with music and sound effects. Same café, two drinks on a dark wooden counter: a hot cappuccino (right) and an iced latte in a short glass (left). First half fast (search, effort, find), then he flops back into the iced latte and floats like it is a pool.</w:t>
       </w:r>
     </w:p>
     <w:tbl>
@@ -1585,7 +1585,7 @@
                 <w:szCs w:val="20"/>
                 <w:rtl w:val="false"/>
               </w:rPr>
-              <w:t xml:space="preserve">7.14–7.28</w:t>
+              <w:t xml:space="preserve">7.14–7.34</w:t>
             </w:r>
           </w:p>
         </w:tc>
@@ -1612,7 +1612,7 @@
                 <w:szCs w:val="20"/>
                 <w:rtl w:val="false"/>
               </w:rPr>
-              <w:t xml:space="preserve">A satisfied glance to camera. Small smile.</w:t>
+              <w:t xml:space="preserve">A satisfied glance to camera, then he turns his head away from the glass.</w:t>
             </w:r>
           </w:p>
         </w:tc>
@@ -1673,7 +1673,7 @@
                 <w:szCs w:val="20"/>
                 <w:rtl w:val="false"/>
               </w:rPr>
-              <w:t xml:space="preserve">7.28–7.68</w:t>
+              <w:t xml:space="preserve">7.34–7.8</w:t>
             </w:r>
           </w:p>
         </w:tc>
@@ -1701,7 +1701,7 @@
                 <w:szCs w:val="20"/>
                 <w:rtl w:val="false"/>
               </w:rPr>
-              <w:t xml:space="preserve">Turns his back to the drink and flops backward into it, arms flung open. His feet knock the ladder away.</w:t>
+              <w:t xml:space="preserve">Tips backward off the ladder, the same figure all the way, arms drifting open, and lands in the float. His feet knock the ladder as he leaves it.</w:t>
             </w:r>
           </w:p>
         </w:tc>
@@ -1762,7 +1762,7 @@
                 <w:szCs w:val="20"/>
                 <w:rtl w:val="false"/>
               </w:rPr>
-              <w:t xml:space="preserve">7.68–8.0</w:t>
+              <w:t xml:space="preserve">7.8–8.1</w:t>
             </w:r>
           </w:p>
         </w:tc>
@@ -1789,7 +1789,7 @@
                 <w:szCs w:val="20"/>
                 <w:rtl w:val="false"/>
               </w:rPr>
-              <w:t xml:space="preserve">Splash. He lies back on the coffee like a pool: head fallen back, face to the sky, eyes closed; arms dropped out past both sides of the cup, hands open; legs loose under the surface. The ladder, pouch and flag are gone: the frame is suddenly clean.</w:t>
+              <w:t xml:space="preserve">Splash. He floats on his back in the coffee like a pool: head toward the back of the cup, face up, eyes closed; arms dropped outward past both sides, round hands; hips and legs under the surface with a waterline. The ladder, pouch and flag fade out in 0.2s: the frame is suddenly clean.</w:t>
             </w:r>
           </w:p>
         </w:tc>
@@ -1850,7 +1850,7 @@
                 <w:szCs w:val="20"/>
                 <w:rtl w:val="false"/>
               </w:rPr>
-              <w:t xml:space="preserve">8.0–8.7</w:t>
+              <w:t xml:space="preserve">8.1–8.8</w:t>
             </w:r>
           </w:p>
         </w:tc>
@@ -1878,7 +1878,7 @@
                 <w:szCs w:val="20"/>
                 <w:rtl w:val="false"/>
               </w:rPr>
-              <w:t xml:space="preserve">Complete peace. Almost motionless. The joke lands before any text.</w:t>
+              <w:t xml:space="preserve">Complete peace. The pose never changes; the whole body drifts 1–2 px. The joke lands before any text.</w:t>
             </w:r>
           </w:p>
         </w:tc>
@@ -1939,7 +1939,7 @@
                 <w:szCs w:val="20"/>
                 <w:rtl w:val="false"/>
               </w:rPr>
-              <w:t xml:space="preserve">8.25–8.7</w:t>
+              <w:t xml:space="preserve">8.38–8.85</w:t>
             </w:r>
           </w:p>
         </w:tc>
@@ -2048,7 +2048,7 @@
                 <w:szCs w:val="20"/>
                 <w:rtl w:val="false"/>
               </w:rPr>
-              <w:t xml:space="preserve">8.7–11.9</w:t>
+              <w:t xml:space="preserve">8.85–12.0</w:t>
             </w:r>
           </w:p>
         </w:tc>
@@ -2076,7 +2076,7 @@
                 <w:szCs w:val="20"/>
                 <w:rtl w:val="false"/>
               </w:rPr>
-              <w:t xml:space="preserve">Holds (~3s): the pose never changes; the whole body drifts 1–2 px; faint ripples; the camera eases in on him.</w:t>
+              <w:t xml:space="preserve">Holds (~3s): floating, faint ripples; the camera eases in on him once he's settled.</w:t>
             </w:r>
           </w:p>
         </w:tc>
@@ -2137,7 +2137,7 @@
                 <w:szCs w:val="20"/>
                 <w:rtl w:val="false"/>
               </w:rPr>
-              <w:t xml:space="preserve">11.9–12.8</w:t>
+              <w:t xml:space="preserve">12.0–12.9</w:t>
             </w:r>
           </w:p>
         </w:tc>
@@ -2225,7 +2225,7 @@
                 <w:szCs w:val="20"/>
                 <w:rtl w:val="false"/>
               </w:rPr>
-              <w:t xml:space="preserve">12.35–12.9</w:t>
+              <w:t xml:space="preserve">12.45–13.0</w:t>
             </w:r>
           </w:p>
         </w:tc>
@@ -2371,7 +2371,7 @@
                 <w:szCs w:val="20"/>
                 <w:rtl w:val="false"/>
               </w:rPr>
-              <w:t xml:space="preserve">12.9–15.2</w:t>
+              <w:t xml:space="preserve">13.0–15.3</w:t>
             </w:r>
           </w:p>
         </w:tc>

</xml_diff>

<commit_message>
Ep.1: slow down to 18s where there is something to read
The 24% badge holds ~1.3s and the 92% ~1s longer, the Arabic line
~4.2s, the end card ~3.2s. The action keeps its pace. One more soft
celesta/pizz note carries the longer peace section.

Co-Authored-By: Claude Fable 5.1 <noreply@anthropic.com>
Claude-Session: https://claude.ai/code/session_01UCKVHF8Bj15Neb29ir5cAN
</commit_message>
<xml_diff>
--- a/marketing/posts/found-my-coffee/export/ep1-ladder-script.docx
+++ b/marketing/posts/found-my-coffee/export/ep1-ladder-script.docx
@@ -73,7 +73,7 @@
           <w:szCs w:val="20"/>
           <w:rtl w:val="false"/>
         </w:rPr>
-        <w:t xml:space="preserve">15.3s · 9:16 vertical · with music and sound effects. Same café, two drinks on a dark wooden counter: a hot cappuccino (right) and an iced latte in a short glass (left). First half fast (search, effort, find), then he flops back into the iced latte and floats like it is a pool.</w:t>
+        <w:t xml:space="preserve">18s · 9:16 vertical · with music and sound effects. Same café, two drinks on a dark wooden counter: a hot cappuccino (right) and an iced latte in a short glass (left). First half fast (search, effort, find), then he flops back into the iced latte and floats like it is a pool.</w:t>
       </w:r>
     </w:p>
     <w:tbl>
@@ -472,7 +472,7 @@
                 <w:szCs w:val="20"/>
                 <w:rtl w:val="false"/>
               </w:rPr>
-              <w:t xml:space="preserve">(light green badge)</w:t>
+              <w:t xml:space="preserve">(light green badge, held ~1.3s)</w:t>
             </w:r>
           </w:p>
         </w:tc>
@@ -591,7 +591,7 @@
                 <w:szCs w:val="20"/>
                 <w:rtl w:val="false"/>
               </w:rPr>
-              <w:t xml:space="preserve">2.2–2.45</w:t>
+              <w:t xml:space="preserve">2.45–2.7</w:t>
             </w:r>
           </w:p>
         </w:tc>
@@ -619,7 +619,7 @@
                 <w:szCs w:val="20"/>
                 <w:rtl w:val="false"/>
               </w:rPr>
-              <w:t xml:space="preserve">Phone down, head lowers.</w:t>
+              <w:t xml:space="preserve">Phone down, head lowers; the badge fades.</w:t>
             </w:r>
           </w:p>
         </w:tc>
@@ -680,7 +680,7 @@
                 <w:szCs w:val="20"/>
                 <w:rtl w:val="false"/>
               </w:rPr>
-              <w:t xml:space="preserve">2.45–3.95</w:t>
+              <w:t xml:space="preserve">2.75–4.25</w:t>
             </w:r>
           </w:p>
         </w:tc>
@@ -768,7 +768,7 @@
                 <w:szCs w:val="20"/>
                 <w:rtl w:val="false"/>
               </w:rPr>
-              <w:t xml:space="preserve">4.0–4.3</w:t>
+              <w:t xml:space="preserve">4.3–4.6</w:t>
             </w:r>
           </w:p>
         </w:tc>
@@ -857,7 +857,7 @@
                 <w:szCs w:val="20"/>
                 <w:rtl w:val="false"/>
               </w:rPr>
-              <w:t xml:space="preserve">4.3–4.55</w:t>
+              <w:t xml:space="preserve">4.6–4.85</w:t>
             </w:r>
           </w:p>
         </w:tc>
@@ -933,7 +933,7 @@
                 <w:szCs w:val="20"/>
                 <w:rtl w:val="false"/>
               </w:rPr>
-              <w:t xml:space="preserve">(dark green badge)</w:t>
+              <w:t xml:space="preserve">(dark green badge, held ~1s)</w:t>
             </w:r>
           </w:p>
         </w:tc>
@@ -965,7 +965,7 @@
                 <w:szCs w:val="20"/>
                 <w:rtl w:val="false"/>
               </w:rPr>
-              <w:t xml:space="preserve">4.55–4.8</w:t>
+              <w:t xml:space="preserve">4.85–5.1</w:t>
             </w:r>
           </w:p>
         </w:tc>
@@ -1054,7 +1054,7 @@
                 <w:szCs w:val="20"/>
                 <w:rtl w:val="false"/>
               </w:rPr>
-              <w:t xml:space="preserve">5.0–5.3</w:t>
+              <w:t xml:space="preserve">5.6–5.9</w:t>
             </w:r>
           </w:p>
         </w:tc>
@@ -1142,7 +1142,7 @@
                 <w:szCs w:val="20"/>
                 <w:rtl w:val="false"/>
               </w:rPr>
-              <w:t xml:space="preserve">5.3–5.6</w:t>
+              <w:t xml:space="preserve">5.9–6.2</w:t>
             </w:r>
           </w:p>
         </w:tc>
@@ -1231,7 +1231,7 @@
                 <w:szCs w:val="20"/>
                 <w:rtl w:val="false"/>
               </w:rPr>
-              <w:t xml:space="preserve">5.62–5.92</w:t>
+              <w:t xml:space="preserve">6.22–6.52</w:t>
             </w:r>
           </w:p>
         </w:tc>
@@ -1319,7 +1319,7 @@
                 <w:szCs w:val="20"/>
                 <w:rtl w:val="false"/>
               </w:rPr>
-              <w:t xml:space="preserve">5.92–6.62</w:t>
+              <w:t xml:space="preserve">6.52–7.22</w:t>
             </w:r>
           </w:p>
         </w:tc>
@@ -1408,7 +1408,7 @@
                 <w:szCs w:val="20"/>
                 <w:rtl w:val="false"/>
               </w:rPr>
-              <w:t xml:space="preserve">6.62–6.96</w:t>
+              <w:t xml:space="preserve">7.22–7.56</w:t>
             </w:r>
           </w:p>
         </w:tc>
@@ -1496,7 +1496,7 @@
                 <w:szCs w:val="20"/>
                 <w:rtl w:val="false"/>
               </w:rPr>
-              <w:t xml:space="preserve">6.98–7.08</w:t>
+              <w:t xml:space="preserve">7.58–7.68</w:t>
             </w:r>
           </w:p>
         </w:tc>
@@ -1585,7 +1585,7 @@
                 <w:szCs w:val="20"/>
                 <w:rtl w:val="false"/>
               </w:rPr>
-              <w:t xml:space="preserve">7.14–7.34</w:t>
+              <w:t xml:space="preserve">7.74–7.94</w:t>
             </w:r>
           </w:p>
         </w:tc>
@@ -1673,7 +1673,7 @@
                 <w:szCs w:val="20"/>
                 <w:rtl w:val="false"/>
               </w:rPr>
-              <w:t xml:space="preserve">7.34–7.8</w:t>
+              <w:t xml:space="preserve">7.94–8.4</w:t>
             </w:r>
           </w:p>
         </w:tc>
@@ -1762,7 +1762,7 @@
                 <w:szCs w:val="20"/>
                 <w:rtl w:val="false"/>
               </w:rPr>
-              <w:t xml:space="preserve">7.8–8.1</w:t>
+              <w:t xml:space="preserve">8.4–8.7</w:t>
             </w:r>
           </w:p>
         </w:tc>
@@ -1850,7 +1850,7 @@
                 <w:szCs w:val="20"/>
                 <w:rtl w:val="false"/>
               </w:rPr>
-              <w:t xml:space="preserve">8.1–8.8</w:t>
+              <w:t xml:space="preserve">8.7–9.4</w:t>
             </w:r>
           </w:p>
         </w:tc>
@@ -1939,7 +1939,7 @@
                 <w:szCs w:val="20"/>
                 <w:rtl w:val="false"/>
               </w:rPr>
-              <w:t xml:space="preserve">8.38–8.85</w:t>
+              <w:t xml:space="preserve">8.98–9.45</w:t>
             </w:r>
           </w:p>
         </w:tc>
@@ -2048,7 +2048,7 @@
                 <w:szCs w:val="20"/>
                 <w:rtl w:val="false"/>
               </w:rPr>
-              <w:t xml:space="preserve">8.85–12.0</w:t>
+              <w:t xml:space="preserve">9.45–13.6</w:t>
             </w:r>
           </w:p>
         </w:tc>
@@ -2076,7 +2076,7 @@
                 <w:szCs w:val="20"/>
                 <w:rtl w:val="false"/>
               </w:rPr>
-              <w:t xml:space="preserve">Holds (~3s): floating, faint ripples; the camera eases in on him once he's settled.</w:t>
+              <w:t xml:space="preserve">Holds (~4.2s to read): floating, faint ripples; the camera eases in on him once he's settled.</w:t>
             </w:r>
           </w:p>
         </w:tc>
@@ -2137,7 +2137,7 @@
                 <w:szCs w:val="20"/>
                 <w:rtl w:val="false"/>
               </w:rPr>
-              <w:t xml:space="preserve">12.0–12.9</w:t>
+              <w:t xml:space="preserve">13.6–14.5</w:t>
             </w:r>
           </w:p>
         </w:tc>
@@ -2225,7 +2225,7 @@
                 <w:szCs w:val="20"/>
                 <w:rtl w:val="false"/>
               </w:rPr>
-              <w:t xml:space="preserve">12.45–13.0</w:t>
+              <w:t xml:space="preserve">14.05–14.8</w:t>
             </w:r>
           </w:p>
         </w:tc>
@@ -2371,7 +2371,7 @@
                 <w:szCs w:val="20"/>
                 <w:rtl w:val="false"/>
               </w:rPr>
-              <w:t xml:space="preserve">13.0–15.3</w:t>
+              <w:t xml:space="preserve">14.8–18.0</w:t>
             </w:r>
           </w:p>
         </w:tc>
@@ -2398,7 +2398,7 @@
                 <w:szCs w:val="20"/>
                 <w:rtl w:val="false"/>
               </w:rPr>
-              <w:t xml:space="preserve">Holds (~2.3s to read).</w:t>
+              <w:t xml:space="preserve">Holds (~3.2s to read).</w:t>
             </w:r>
           </w:p>
         </w:tc>

</xml_diff>

<commit_message>
Ep.1: original action pace after the 92%, flag stays, he pushes the ladder
- unpack, three clicks, climb (7 half-strides) and the flag are back at
  the original, unhurried timing; only the text holds are slow
- the fall no longer knocks the ladder; once he's settled a foot comes
  up out of the coffee and shoves it, it tips and clatters onto the
  counter, then it and the pouch fade out
- the planted flag stays on the rim through the payoff and the end
- kick/push/clatter cues back in the mix; six rung notes

Co-Authored-By: Claude Fable 5.1 <noreply@anthropic.com>
Claude-Session: https://claude.ai/code/session_01UCKVHF8Bj15Neb29ir5cAN
</commit_message>
<xml_diff>
--- a/marketing/posts/found-my-coffee/export/ep1-ladder-script.docx
+++ b/marketing/posts/found-my-coffee/export/ep1-ladder-script.docx
@@ -73,7 +73,7 @@
           <w:szCs w:val="20"/>
           <w:rtl w:val="false"/>
         </w:rPr>
-        <w:t xml:space="preserve">18s · 9:16 vertical · with music and sound effects. Same café, two drinks on a dark wooden counter: a hot cappuccino (right) and an iced latte in a short glass (left). First half fast (search, effort, find), then he flops back into the iced latte and floats like it is a pool.</w:t>
+        <w:t xml:space="preserve">18.6s · 9:16 vertical · with music and sound effects. Same café, two drinks on a dark wooden counter: a hot cappuccino (right) and an iced latte in a short glass (left). First half fast (search, effort, find), then he flops back into the iced latte and floats like it is a pool.</w:t>
       </w:r>
     </w:p>
     <w:tbl>
@@ -857,7 +857,7 @@
                 <w:szCs w:val="20"/>
                 <w:rtl w:val="false"/>
               </w:rPr>
-              <w:t xml:space="preserve">4.6–4.85</w:t>
+              <w:t xml:space="preserve">4.6–4.95</w:t>
             </w:r>
           </w:p>
         </w:tc>
@@ -965,7 +965,7 @@
                 <w:szCs w:val="20"/>
                 <w:rtl w:val="false"/>
               </w:rPr>
-              <w:t xml:space="preserve">4.85–5.1</w:t>
+              <w:t xml:space="preserve">4.95–5.2</w:t>
             </w:r>
           </w:p>
         </w:tc>
@@ -1054,7 +1054,7 @@
                 <w:szCs w:val="20"/>
                 <w:rtl w:val="false"/>
               </w:rPr>
-              <w:t xml:space="preserve">5.6–5.9</w:t>
+              <w:t xml:space="preserve">5.6–6.0</w:t>
             </w:r>
           </w:p>
         </w:tc>
@@ -1081,7 +1081,7 @@
                 <w:szCs w:val="20"/>
                 <w:rtl w:val="false"/>
               </w:rPr>
-              <w:t xml:space="preserve">Sets the pouch down, flips it open.</w:t>
+              <w:t xml:space="preserve">Crouches, sets the pouch down, opens the flap.</w:t>
             </w:r>
           </w:p>
         </w:tc>
@@ -1142,7 +1142,7 @@
                 <w:szCs w:val="20"/>
                 <w:rtl w:val="false"/>
               </w:rPr>
-              <w:t xml:space="preserve">5.9–6.2</w:t>
+              <w:t xml:space="preserve">6.0–6.45</w:t>
             </w:r>
           </w:p>
         </w:tc>
@@ -1170,7 +1170,7 @@
                 <w:szCs w:val="20"/>
                 <w:rtl w:val="false"/>
               </w:rPr>
-              <w:t xml:space="preserve">Pulls out a folded ladder, plants it against the glass.</w:t>
+              <w:t xml:space="preserve">Pulls out a folded ladder, carries it over, plants it against the glass.</w:t>
             </w:r>
           </w:p>
         </w:tc>
@@ -1231,7 +1231,7 @@
                 <w:szCs w:val="20"/>
                 <w:rtl w:val="false"/>
               </w:rPr>
-              <w:t xml:space="preserve">6.22–6.52</w:t>
+              <w:t xml:space="preserve">6.45–6.85</w:t>
             </w:r>
           </w:p>
         </w:tc>
@@ -1319,7 +1319,7 @@
                 <w:szCs w:val="20"/>
                 <w:rtl w:val="false"/>
               </w:rPr>
-              <w:t xml:space="preserve">6.52–7.22</w:t>
+              <w:t xml:space="preserve">6.85–8.0</w:t>
             </w:r>
           </w:p>
         </w:tc>
@@ -1347,7 +1347,7 @@
                 <w:szCs w:val="20"/>
                 <w:rtl w:val="false"/>
               </w:rPr>
-              <w:t xml:space="preserve">Climbs, fast, rung by rung.</w:t>
+              <w:t xml:space="preserve">Climbs, rung by rung.</w:t>
             </w:r>
           </w:p>
         </w:tc>
@@ -1408,7 +1408,7 @@
                 <w:szCs w:val="20"/>
                 <w:rtl w:val="false"/>
               </w:rPr>
-              <w:t xml:space="preserve">7.22–7.56</w:t>
+              <w:t xml:space="preserve">8.0–8.52</w:t>
             </w:r>
           </w:p>
         </w:tc>
@@ -1496,7 +1496,7 @@
                 <w:szCs w:val="20"/>
                 <w:rtl w:val="false"/>
               </w:rPr>
-              <w:t xml:space="preserve">7.58–7.68</w:t>
+              <w:t xml:space="preserve">8.56–8.68</w:t>
             </w:r>
           </w:p>
         </w:tc>
@@ -1585,7 +1585,7 @@
                 <w:szCs w:val="20"/>
                 <w:rtl w:val="false"/>
               </w:rPr>
-              <w:t xml:space="preserve">7.74–7.94</w:t>
+              <w:t xml:space="preserve">8.74–9.1</w:t>
             </w:r>
           </w:p>
         </w:tc>
@@ -1673,7 +1673,7 @@
                 <w:szCs w:val="20"/>
                 <w:rtl w:val="false"/>
               </w:rPr>
-              <w:t xml:space="preserve">7.94–8.4</w:t>
+              <w:t xml:space="preserve">9.1–9.56</w:t>
             </w:r>
           </w:p>
         </w:tc>
@@ -1701,7 +1701,7 @@
                 <w:szCs w:val="20"/>
                 <w:rtl w:val="false"/>
               </w:rPr>
-              <w:t xml:space="preserve">Tips backward off the ladder, the same figure all the way, arms drifting open, and lands in the float. His feet knock the ladder as he leaves it.</w:t>
+              <w:t xml:space="preserve">Tips backward off the ladder, the same figure all the way, arms drifting open, and lands in the float.</w:t>
             </w:r>
           </w:p>
         </w:tc>
@@ -1762,7 +1762,7 @@
                 <w:szCs w:val="20"/>
                 <w:rtl w:val="false"/>
               </w:rPr>
-              <w:t xml:space="preserve">8.4–8.7</w:t>
+              <w:t xml:space="preserve">9.56–9.86</w:t>
             </w:r>
           </w:p>
         </w:tc>
@@ -1789,7 +1789,7 @@
                 <w:szCs w:val="20"/>
                 <w:rtl w:val="false"/>
               </w:rPr>
-              <w:t xml:space="preserve">Splash. He floats on his back in the coffee like a pool: head toward the back of the cup, face up, eyes closed; arms dropped outward past both sides, round hands; hips and legs under the surface with a waterline. The ladder, pouch and flag fade out in 0.2s: the frame is suddenly clean.</w:t>
+              <w:t xml:space="preserve">Splash. He floats on his back in the coffee like a pool: head toward the back of the cup, face up, eyes closed; arms dropped outward past both sides, round hands; hips and legs under the surface with a waterline. The flag stays on the rim beside him.</w:t>
             </w:r>
           </w:p>
         </w:tc>
@@ -1850,7 +1850,7 @@
                 <w:szCs w:val="20"/>
                 <w:rtl w:val="false"/>
               </w:rPr>
-              <w:t xml:space="preserve">8.7–9.4</w:t>
+              <w:t xml:space="preserve">10.16–10.36</w:t>
             </w:r>
           </w:p>
         </w:tc>
@@ -1878,7 +1878,7 @@
                 <w:szCs w:val="20"/>
                 <w:rtl w:val="false"/>
               </w:rPr>
-              <w:t xml:space="preserve">Complete peace. The pose never changes; the whole body drifts 1–2 px. The joke lands before any text.</w:t>
+              <w:t xml:space="preserve">Done with the ladder: a foot comes up out of the coffee and shoves it.</w:t>
             </w:r>
           </w:p>
         </w:tc>
@@ -1939,7 +1939,184 @@
                 <w:szCs w:val="20"/>
                 <w:rtl w:val="false"/>
               </w:rPr>
-              <w:t xml:space="preserve">8.98–9.45</w:t>
+              <w:t xml:space="preserve">10.36–10.86</w:t>
+            </w:r>
+          </w:p>
+        </w:tc>
+        <w:tc>
+          <w:tcPr>
+            <w:tcW w:type="dxa" w:w="4450"/>
+            <w:tcMar>
+              <w:top w:type="dxa" w:w="80"/>
+              <w:left w:type="dxa" w:w="110"/>
+              <w:bottom w:type="dxa" w:w="80"/>
+              <w:right w:type="dxa" w:w="110"/>
+            </w:tcMar>
+          </w:tcPr>
+          <w:p>
+            <w:pPr>
+              <w:bidi w:val="false"/>
+              <w:spacing w:after="0"/>
+              <w:jc w:val="left"/>
+            </w:pPr>
+            <w:r>
+              <w:rPr>
+                <w:rFonts w:ascii="Calibri" w:cs="Calibri" w:eastAsia="Calibri" w:hAnsi="Calibri"/>
+                <w:sz w:val="20"/>
+                <w:szCs w:val="20"/>
+                <w:rtl w:val="false"/>
+              </w:rPr>
+              <w:t xml:space="preserve">The ladder tips over and clatters onto the counter.</w:t>
+            </w:r>
+          </w:p>
+        </w:tc>
+        <w:tc>
+          <w:tcPr>
+            <w:tcW w:type="dxa" w:w="3150"/>
+            <w:tcMar>
+              <w:top w:type="dxa" w:w="80"/>
+              <w:left w:type="dxa" w:w="110"/>
+              <w:bottom w:type="dxa" w:w="80"/>
+              <w:right w:type="dxa" w:w="110"/>
+            </w:tcMar>
+          </w:tcPr>
+          <w:p>
+            <w:pPr>
+              <w:bidi w:val="false"/>
+              <w:spacing w:after="0"/>
+              <w:jc w:val="left"/>
+            </w:pPr>
+            <w:r>
+              <w:rPr>
+                <w:rFonts w:ascii="Calibri" w:cs="Calibri" w:eastAsia="Calibri" w:hAnsi="Calibri"/>
+                <w:b w:val="false"/>
+                <w:bCs w:val="false"/>
+                <w:sz w:val="20"/>
+                <w:szCs w:val="20"/>
+                <w:rtl w:val="false"/>
+              </w:rPr>
+              <w:t xml:space="preserve">—</w:t>
+            </w:r>
+          </w:p>
+        </w:tc>
+      </w:tr>
+      <w:tr>
+        <w:tc>
+          <w:tcPr>
+            <w:tcW w:type="dxa" w:w="1750"/>
+            <w:shd w:fill="F7F6F1" w:color="auto" w:val="clear"/>
+            <w:tcMar>
+              <w:top w:type="dxa" w:w="80"/>
+              <w:left w:type="dxa" w:w="110"/>
+              <w:bottom w:type="dxa" w:w="80"/>
+              <w:right w:type="dxa" w:w="110"/>
+            </w:tcMar>
+          </w:tcPr>
+          <w:p>
+            <w:pPr>
+              <w:bidi w:val="false"/>
+              <w:spacing w:after="0"/>
+              <w:jc w:val="left"/>
+            </w:pPr>
+            <w:r>
+              <w:rPr>
+                <w:rFonts w:ascii="Calibri" w:cs="Calibri" w:eastAsia="Calibri" w:hAnsi="Calibri"/>
+                <w:b/>
+                <w:bCs/>
+                <w:sz w:val="20"/>
+                <w:szCs w:val="20"/>
+                <w:rtl w:val="false"/>
+              </w:rPr>
+              <w:t xml:space="preserve">11.2–11.6</w:t>
+            </w:r>
+          </w:p>
+        </w:tc>
+        <w:tc>
+          <w:tcPr>
+            <w:tcW w:type="dxa" w:w="4450"/>
+            <w:shd w:fill="F7F6F1" w:color="auto" w:val="clear"/>
+            <w:tcMar>
+              <w:top w:type="dxa" w:w="80"/>
+              <w:left w:type="dxa" w:w="110"/>
+              <w:bottom w:type="dxa" w:w="80"/>
+              <w:right w:type="dxa" w:w="110"/>
+            </w:tcMar>
+          </w:tcPr>
+          <w:p>
+            <w:pPr>
+              <w:bidi w:val="false"/>
+              <w:spacing w:after="0"/>
+              <w:jc w:val="left"/>
+            </w:pPr>
+            <w:r>
+              <w:rPr>
+                <w:rFonts w:ascii="Calibri" w:cs="Calibri" w:eastAsia="Calibri" w:hAnsi="Calibri"/>
+                <w:sz w:val="20"/>
+                <w:szCs w:val="20"/>
+                <w:rtl w:val="false"/>
+              </w:rPr>
+              <w:t xml:space="preserve">The ladder and the pouch fade out: the frame is clean. Only the two drinks, him, and his flag.</w:t>
+            </w:r>
+          </w:p>
+        </w:tc>
+        <w:tc>
+          <w:tcPr>
+            <w:tcW w:type="dxa" w:w="3150"/>
+            <w:shd w:fill="F7F6F1" w:color="auto" w:val="clear"/>
+            <w:tcMar>
+              <w:top w:type="dxa" w:w="80"/>
+              <w:left w:type="dxa" w:w="110"/>
+              <w:bottom w:type="dxa" w:w="80"/>
+              <w:right w:type="dxa" w:w="110"/>
+            </w:tcMar>
+          </w:tcPr>
+          <w:p>
+            <w:pPr>
+              <w:bidi w:val="false"/>
+              <w:spacing w:after="0"/>
+              <w:jc w:val="left"/>
+            </w:pPr>
+            <w:r>
+              <w:rPr>
+                <w:rFonts w:ascii="Calibri" w:cs="Calibri" w:eastAsia="Calibri" w:hAnsi="Calibri"/>
+                <w:b w:val="false"/>
+                <w:bCs w:val="false"/>
+                <w:sz w:val="20"/>
+                <w:szCs w:val="20"/>
+                <w:rtl w:val="false"/>
+              </w:rPr>
+              <w:t xml:space="preserve">—</w:t>
+            </w:r>
+          </w:p>
+        </w:tc>
+      </w:tr>
+      <w:tr>
+        <w:tc>
+          <w:tcPr>
+            <w:tcW w:type="dxa" w:w="1750"/>
+            <w:tcMar>
+              <w:top w:type="dxa" w:w="80"/>
+              <w:left w:type="dxa" w:w="110"/>
+              <w:bottom w:type="dxa" w:w="80"/>
+              <w:right w:type="dxa" w:w="110"/>
+            </w:tcMar>
+          </w:tcPr>
+          <w:p>
+            <w:pPr>
+              <w:bidi w:val="false"/>
+              <w:spacing w:after="0"/>
+              <w:jc w:val="left"/>
+            </w:pPr>
+            <w:r>
+              <w:rPr>
+                <w:rFonts w:ascii="Calibri" w:cs="Calibri" w:eastAsia="Calibri" w:hAnsi="Calibri"/>
+                <w:b/>
+                <w:bCs/>
+                <w:sz w:val="20"/>
+                <w:szCs w:val="20"/>
+                <w:rtl w:val="false"/>
+              </w:rPr>
+              <w:t xml:space="preserve">11.3–11.75</w:t>
             </w:r>
           </w:p>
         </w:tc>
@@ -2048,7 +2225,7 @@
                 <w:szCs w:val="20"/>
                 <w:rtl w:val="false"/>
               </w:rPr>
-              <w:t xml:space="preserve">9.45–13.6</w:t>
+              <w:t xml:space="preserve">11.75–15.5</w:t>
             </w:r>
           </w:p>
         </w:tc>
@@ -2076,7 +2253,7 @@
                 <w:szCs w:val="20"/>
                 <w:rtl w:val="false"/>
               </w:rPr>
-              <w:t xml:space="preserve">Holds (~4.2s to read): floating, faint ripples; the camera eases in on him once he's settled.</w:t>
+              <w:t xml:space="preserve">Holds (~3.8s to read): floating, the pose unchanged, faint ripples; the camera eases in on him.</w:t>
             </w:r>
           </w:p>
         </w:tc>
@@ -2137,7 +2314,7 @@
                 <w:szCs w:val="20"/>
                 <w:rtl w:val="false"/>
               </w:rPr>
-              <w:t xml:space="preserve">13.6–14.5</w:t>
+              <w:t xml:space="preserve">15.5–16.4</w:t>
             </w:r>
           </w:p>
         </w:tc>
@@ -2225,7 +2402,7 @@
                 <w:szCs w:val="20"/>
                 <w:rtl w:val="false"/>
               </w:rPr>
-              <w:t xml:space="preserve">14.05–14.8</w:t>
+              <w:t xml:space="preserve">15.95–16.7</w:t>
             </w:r>
           </w:p>
         </w:tc>
@@ -2371,7 +2548,7 @@
                 <w:szCs w:val="20"/>
                 <w:rtl w:val="false"/>
               </w:rPr>
-              <w:t xml:space="preserve">14.8–18.0</w:t>
+              <w:t xml:space="preserve">16.7–18.6</w:t>
             </w:r>
           </w:p>
         </w:tc>
@@ -2398,7 +2575,7 @@
                 <w:szCs w:val="20"/>
                 <w:rtl w:val="false"/>
               </w:rPr>
-              <w:t xml:space="preserve">Holds (~3.2s to read).</w:t>
+              <w:t xml:space="preserve">Holds (~2s to read).</w:t>
             </w:r>
           </w:p>
         </w:tc>

</xml_diff>